<commit_message>
Update user guide - remove Markdown, add toolbar instructions
Rewritten for non-technical users: step-by-step with toolbar button
guide, no mention of Markdown or code syntax.

Co-Authored-By: Claude Opus 4.6 <noreply@anthropic.com>
</commit_message>
<xml_diff>
--- a/CCSK_Poster_Generator_User_Guide.docx
+++ b/CCSK_Poster_Generator_User_Guide.docx
@@ -90,150 +90,17 @@
         <w:pStyle w:val="Heading1"/>
       </w:pPr>
       <w:r>
-        <w:t>Table of Contents</w:t>
+        <w:t>1. What is this tool?</w:t>
       </w:r>
     </w:p>
     <w:p>
       <w:r>
-        <w:rPr>
-          <w:sz w:val="22"/>
-        </w:rPr>
-        <w:t>1.  Introduction</w:t>
+        <w:t>The CCSK Scientific Poster Generator is a free online tool that helps you create a professional, print-ready scientific poster for the conference. You do not need any design software — just type your content into the website, and it creates a beautifully formatted A0 PDF poster with the CCSK conference branding.</w:t>
       </w:r>
     </w:p>
     <w:p>
       <w:r>
-        <w:rPr>
-          <w:sz w:val="22"/>
-        </w:rPr>
-        <w:t>2.  Getting Started</w:t>
-      </w:r>
-    </w:p>
-    <w:p>
-      <w:r>
-        <w:rPr>
-          <w:sz w:val="22"/>
-        </w:rPr>
-        <w:t>3.  Step-by-Step Guide</w:t>
-      </w:r>
-    </w:p>
-    <w:p>
-      <w:r>
-        <w:rPr>
-          <w:sz w:val="22"/>
-        </w:rPr>
-        <w:t>4.  Writing Content in Markdown</w:t>
-      </w:r>
-    </w:p>
-    <w:p>
-      <w:r>
-        <w:rPr>
-          <w:sz w:val="22"/>
-        </w:rPr>
-        <w:t>5.  Uploading Images</w:t>
-      </w:r>
-    </w:p>
-    <w:p>
-      <w:r>
-        <w:rPr>
-          <w:sz w:val="22"/>
-        </w:rPr>
-        <w:t>6.  Previewing Your Poster</w:t>
-      </w:r>
-    </w:p>
-    <w:p>
-      <w:r>
-        <w:rPr>
-          <w:sz w:val="22"/>
-        </w:rPr>
-        <w:t>7.  Downloading Your PDF</w:t>
-      </w:r>
-    </w:p>
-    <w:p>
-      <w:r>
-        <w:rPr>
-          <w:sz w:val="22"/>
-        </w:rPr>
-        <w:t>8.  Tips for a Great Poster</w:t>
-      </w:r>
-    </w:p>
-    <w:p>
-      <w:r>
-        <w:rPr>
-          <w:sz w:val="22"/>
-        </w:rPr>
-        <w:t>9.  Troubleshooting</w:t>
-      </w:r>
-    </w:p>
-    <w:p>
-      <w:r>
-        <w:rPr>
-          <w:sz w:val="22"/>
-        </w:rPr>
-        <w:t>10.  Support</w:t>
-      </w:r>
-    </w:p>
-    <w:p>
-      <w:r>
-        <w:br w:type="page"/>
-      </w:r>
-    </w:p>
-    <w:p>
-      <w:pPr>
-        <w:pStyle w:val="Heading1"/>
-      </w:pPr>
-      <w:r>
-        <w:t>1. Introduction</w:t>
-      </w:r>
-    </w:p>
-    <w:p>
-      <w:r>
-        <w:t>The CCSK Scientific Poster Generator is a web-based tool that allows conference participants to create professional A0-sized scientific posters without needing any design software. You simply type your content using simple Markdown formatting, and the tool generates a beautifully branded PDF poster ready for printing.</w:t>
-      </w:r>
-    </w:p>
-    <w:p>
-      <w:r>
-        <w:t>With this tool, you can:</w:t>
-      </w:r>
-    </w:p>
-    <w:p>
-      <w:pPr>
-        <w:pStyle w:val="ListBullet"/>
-      </w:pPr>
-      <w:r>
-        <w:t>Write your poster content in simple, plain text with Markdown formatting</w:t>
-      </w:r>
-    </w:p>
-    <w:p>
-      <w:pPr>
-        <w:pStyle w:val="ListBullet"/>
-      </w:pPr>
-      <w:r>
-        <w:t>Organize content across three columns (as per standard scientific poster layout)</w:t>
-      </w:r>
-    </w:p>
-    <w:p>
-      <w:pPr>
-        <w:pStyle w:val="ListBullet"/>
-      </w:pPr>
-      <w:r>
-        <w:t>Upload and embed figures, charts, and images</w:t>
-      </w:r>
-    </w:p>
-    <w:p>
-      <w:pPr>
-        <w:pStyle w:val="ListBullet"/>
-      </w:pPr>
-      <w:r>
-        <w:t>Preview your poster in the browser before downloading</w:t>
-      </w:r>
-    </w:p>
-    <w:p>
-      <w:pPr>
-        <w:pStyle w:val="ListBullet"/>
-      </w:pPr>
-      <w:r>
-        <w:t>Download a print-ready A0 PDF with full CCSK conference branding</w:t>
+        <w:t>No special skills are required. If you can type in Microsoft Word, you can use this tool.</w:t>
       </w:r>
     </w:p>
     <w:p>
@@ -249,7 +116,7 @@
         <w:pStyle w:val="Heading2"/>
       </w:pPr>
       <w:r>
-        <w:t>What You Need</w:t>
+        <w:t>What you need</w:t>
       </w:r>
     </w:p>
     <w:p>
@@ -257,7 +124,7 @@
         <w:pStyle w:val="ListBullet"/>
       </w:pPr>
       <w:r>
-        <w:t>A web browser (Chrome, Firefox, Safari, or Edge)</w:t>
+        <w:t>A computer with a web browser (Chrome, Safari, Firefox, or Edge)</w:t>
       </w:r>
     </w:p>
     <w:p>
@@ -273,7 +140,7 @@
         <w:pStyle w:val="ListBullet"/>
       </w:pPr>
       <w:r>
-        <w:t>Your poster content (text, figures, tables)</w:t>
+        <w:t>Your poster content (text and any figures/charts as image files)</w:t>
       </w:r>
     </w:p>
     <w:p>
@@ -281,7 +148,7 @@
         <w:pStyle w:val="Heading2"/>
       </w:pPr>
       <w:r>
-        <w:t>Accessing the Tool</w:t>
+        <w:t>Open the tool</w:t>
       </w:r>
     </w:p>
     <w:p>
@@ -297,14 +164,14 @@
         <w:rPr>
           <w:b/>
           <w:color w:val="3C608C"/>
-          <w:sz w:val="26"/>
+          <w:sz w:val="28"/>
         </w:rPr>
         <w:t>https://ccsk-poster-generator.onrender.com</w:t>
       </w:r>
     </w:p>
     <w:p>
       <w:r>
-        <w:t>The poster generator will load with a clean interface showing the form fields and three column editors.</w:t>
+        <w:t>Note: The first time you visit, the page may take 30–60 seconds to load. This is normal — please wait and it will appear.</w:t>
       </w:r>
     </w:p>
     <w:p>
@@ -312,7 +179,7 @@
         <w:pStyle w:val="Heading1"/>
       </w:pPr>
       <w:r>
-        <w:t>3. Step-by-Step Guide</w:t>
+        <w:t>3. Creating Your Poster — Step by Step</w:t>
       </w:r>
     </w:p>
     <w:p>
@@ -320,12 +187,12 @@
         <w:pStyle w:val="Heading2"/>
       </w:pPr>
       <w:r>
-        <w:t>Step 1: Fill in Poster Details</w:t>
+        <w:t>Step 1: Fill in your poster details</w:t>
       </w:r>
     </w:p>
     <w:p>
       <w:r>
-        <w:t>At the top of the page, fill in the following fields:</w:t>
+        <w:t>At the top of the page, you will see four fields:</w:t>
       </w:r>
     </w:p>
     <w:tbl>
@@ -362,7 +229,7 @@
               <w:rPr>
                 <w:b/>
               </w:rPr>
-              <w:t>What to Enter</w:t>
+              <w:t>What to type</w:t>
             </w:r>
           </w:p>
         </w:tc>
@@ -406,7 +273,7 @@
           </w:tcPr>
           <w:p>
             <w:r>
-              <w:t>All author names, e.g. "J. Smith, A. Mwangi, P. Ochieng"</w:t>
+              <w:t>All author names, separated by commas</w:t>
             </w:r>
           </w:p>
         </w:tc>
@@ -428,7 +295,7 @@
           </w:tcPr>
           <w:p>
             <w:r>
-              <w:t>Departments and institutions, e.g. "Dept. of Critical Care, KNH"</w:t>
+              <w:t>Your department(s) and institution(s)</w:t>
             </w:r>
           </w:p>
         </w:tc>
@@ -450,7 +317,7 @@
           </w:tcPr>
           <w:p>
             <w:r>
-              <w:t>Corresponding author email address</w:t>
+              <w:t>The corresponding author’s email</w:t>
             </w:r>
           </w:p>
         </w:tc>
@@ -462,12 +329,58 @@
         <w:pStyle w:val="Heading2"/>
       </w:pPr>
       <w:r>
-        <w:t>Step 2: Write Your Content</w:t>
+        <w:t>Step 2: Write your content</w:t>
       </w:r>
     </w:p>
     <w:p>
       <w:r>
-        <w:t>Below the poster details, you will see three column editors. Each column can contain multiple sections. The recommended layout is:</w:t>
+        <w:t>Below the poster details you will see three columns. Each column has a text editor that works just like Microsoft Word:</w:t>
+      </w:r>
+    </w:p>
+    <w:p>
+      <w:pPr>
+        <w:pStyle w:val="ListBullet"/>
+      </w:pPr>
+      <w:r>
+        <w:t>Click inside the white text area and start typing</w:t>
+      </w:r>
+    </w:p>
+    <w:p>
+      <w:pPr>
+        <w:pStyle w:val="ListBullet"/>
+      </w:pPr>
+      <w:r>
+        <w:t>Use the toolbar buttons at the top of each text area to make text bold, italic, or create lists</w:t>
+      </w:r>
+    </w:p>
+    <w:p>
+      <w:pPr>
+        <w:pStyle w:val="ListBullet"/>
+      </w:pPr>
+      <w:r>
+        <w:t>Each section has a heading field at the top — type your section title there (e.g. "Introduction")</w:t>
+      </w:r>
+    </w:p>
+    <w:p>
+      <w:pPr>
+        <w:pStyle w:val="ListBullet"/>
+      </w:pPr>
+      <w:r>
+        <w:t>Click "+ Add Section" below any column to add more sections</w:t>
+      </w:r>
+    </w:p>
+    <w:p>
+      <w:pPr>
+        <w:pStyle w:val="ListBullet"/>
+      </w:pPr>
+      <w:r>
+        <w:t>Click the × button on a section to remove it</w:t>
+      </w:r>
+    </w:p>
+    <w:p/>
+    <w:p>
+      <w:r>
+        <w:t>We recommend organising your poster like this:</w:t>
       </w:r>
     </w:p>
     <w:tbl>
@@ -603,9 +516,7 @@
             <w:tcW w:type="dxa" w:w="2880"/>
           </w:tcPr>
           <w:p>
-            <w:r>
-              <w:t>(additional results)</w:t>
-            </w:r>
+            <w:r/>
           </w:p>
         </w:tc>
         <w:tc>
@@ -622,8 +533,16 @@
     </w:tbl>
     <w:p/>
     <w:p>
+      <w:pPr>
+        <w:pStyle w:val="Heading2"/>
+      </w:pPr>
       <w:r>
-        <w:t>For each section:</w:t>
+        <w:t>Step 3: Add images and figures</w:t>
+      </w:r>
+    </w:p>
+    <w:p>
+      <w:r>
+        <w:t>To insert a figure, chart, or image into your poster:</w:t>
       </w:r>
     </w:p>
     <w:p>
@@ -631,7 +550,7 @@
         <w:pStyle w:val="ListBullet"/>
       </w:pPr>
       <w:r>
-        <w:t>Type a heading (e.g. "Introduction") in the heading field</w:t>
+        <w:t>Click inside the text area where you want the image to appear</w:t>
       </w:r>
     </w:p>
     <w:p>
@@ -639,7 +558,7 @@
         <w:pStyle w:val="ListBullet"/>
       </w:pPr>
       <w:r>
-        <w:t>Write your content in the text area using Markdown (see Section 4)</w:t>
+        <w:t>Click the image button in the toolbar (it looks like a small picture icon)</w:t>
       </w:r>
     </w:p>
     <w:p>
@@ -647,7 +566,7 @@
         <w:pStyle w:val="ListBullet"/>
       </w:pPr>
       <w:r>
-        <w:t>Tick "Highlighted" if you want that section to have a blue background</w:t>
+        <w:t>Select the image file from your computer</w:t>
       </w:r>
     </w:p>
     <w:p>
@@ -655,7 +574,240 @@
         <w:pStyle w:val="ListBullet"/>
       </w:pPr>
       <w:r>
-        <w:t>Click "+ Add Section" to add more sections to any column</w:t>
+        <w:t>The image will be inserted automatically</w:t>
+      </w:r>
+    </w:p>
+    <w:p/>
+    <w:p>
+      <w:r>
+        <w:rPr>
+          <w:b/>
+        </w:rPr>
+        <w:t xml:space="preserve">Tip: </w:t>
+      </w:r>
+      <w:r>
+        <w:t>For the best print quality, use high-resolution images (300 DPI or higher). Charts exported from Excel, SPSS, or R work well. Avoid small screenshots.</w:t>
+      </w:r>
+    </w:p>
+    <w:p>
+      <w:pPr>
+        <w:pStyle w:val="Heading2"/>
+      </w:pPr>
+      <w:r>
+        <w:t>Step 4: Highlight important sections (optional)</w:t>
+      </w:r>
+    </w:p>
+    <w:p>
+      <w:r>
+        <w:t>Tick the "Highlighted section" checkbox on any section to give it a blue background. This is useful for drawing attention to your key findings or conclusion.</w:t>
+      </w:r>
+    </w:p>
+    <w:p>
+      <w:pPr>
+        <w:pStyle w:val="Heading2"/>
+      </w:pPr>
+      <w:r>
+        <w:t>Step 5: Preview your poster</w:t>
+      </w:r>
+    </w:p>
+    <w:p>
+      <w:r>
+        <w:t>Click the "Preview Poster" button to see how your poster will look. A preview will appear at the bottom of the page. Check that your text, images, and layout look correct.</w:t>
+      </w:r>
+    </w:p>
+    <w:p>
+      <w:pPr>
+        <w:pStyle w:val="Heading2"/>
+      </w:pPr>
+      <w:r>
+        <w:t>Step 6: Download your PDF</w:t>
+      </w:r>
+    </w:p>
+    <w:p>
+      <w:r>
+        <w:t>When you are happy with the preview, click "Download PDF". A file called "CCSK_Poster.pdf" will be saved to your Downloads folder. This is your final poster, ready for printing.</w:t>
+      </w:r>
+    </w:p>
+    <w:p>
+      <w:pPr>
+        <w:pStyle w:val="Heading1"/>
+      </w:pPr>
+      <w:r>
+        <w:t>4. Using the Text Editor Toolbar</w:t>
+      </w:r>
+    </w:p>
+    <w:p>
+      <w:r>
+        <w:t>Each text area has a small toolbar with these buttons:</w:t>
+      </w:r>
+    </w:p>
+    <w:tbl>
+      <w:tblPr>
+        <w:tblStyle w:val="LightGrid-Accent1"/>
+        <w:tblW w:type="auto" w:w="0"/>
+        <w:jc w:val="center"/>
+        <w:tblLook w:firstColumn="1" w:firstRow="1" w:lastColumn="0" w:lastRow="0" w:noHBand="0" w:noVBand="1" w:val="04A0"/>
+      </w:tblPr>
+      <w:tblGrid>
+        <w:gridCol w:w="4320"/>
+        <w:gridCol w:w="4320"/>
+      </w:tblGrid>
+      <w:tr>
+        <w:tc>
+          <w:tcPr>
+            <w:tcW w:type="dxa" w:w="4320"/>
+          </w:tcPr>
+          <w:p>
+            <w:r>
+              <w:rPr>
+                <w:b/>
+              </w:rPr>
+              <w:t>Button</w:t>
+            </w:r>
+          </w:p>
+        </w:tc>
+        <w:tc>
+          <w:tcPr>
+            <w:tcW w:type="dxa" w:w="4320"/>
+          </w:tcPr>
+          <w:p>
+            <w:r>
+              <w:rPr>
+                <w:b/>
+              </w:rPr>
+              <w:t>What it does</w:t>
+            </w:r>
+          </w:p>
+        </w:tc>
+      </w:tr>
+      <w:tr>
+        <w:tc>
+          <w:tcPr>
+            <w:tcW w:type="dxa" w:w="4320"/>
+          </w:tcPr>
+          <w:p>
+            <w:r>
+              <w:t>B</w:t>
+            </w:r>
+          </w:p>
+        </w:tc>
+        <w:tc>
+          <w:tcPr>
+            <w:tcW w:type="dxa" w:w="4320"/>
+          </w:tcPr>
+          <w:p>
+            <w:r>
+              <w:t>Makes selected text bold</w:t>
+            </w:r>
+          </w:p>
+        </w:tc>
+      </w:tr>
+      <w:tr>
+        <w:tc>
+          <w:tcPr>
+            <w:tcW w:type="dxa" w:w="4320"/>
+          </w:tcPr>
+          <w:p>
+            <w:r>
+              <w:t>I</w:t>
+            </w:r>
+          </w:p>
+        </w:tc>
+        <w:tc>
+          <w:tcPr>
+            <w:tcW w:type="dxa" w:w="4320"/>
+          </w:tcPr>
+          <w:p>
+            <w:r>
+              <w:t>Makes selected text italic</w:t>
+            </w:r>
+          </w:p>
+        </w:tc>
+      </w:tr>
+      <w:tr>
+        <w:tc>
+          <w:tcPr>
+            <w:tcW w:type="dxa" w:w="4320"/>
+          </w:tcPr>
+          <w:p>
+            <w:r>
+              <w:t>U</w:t>
+            </w:r>
+          </w:p>
+        </w:tc>
+        <w:tc>
+          <w:tcPr>
+            <w:tcW w:type="dxa" w:w="4320"/>
+          </w:tcPr>
+          <w:p>
+            <w:r>
+              <w:t>Underlines selected text</w:t>
+            </w:r>
+          </w:p>
+        </w:tc>
+      </w:tr>
+      <w:tr>
+        <w:tc>
+          <w:tcPr>
+            <w:tcW w:type="dxa" w:w="4320"/>
+          </w:tcPr>
+          <w:p>
+            <w:r>
+              <w:t>List icons</w:t>
+            </w:r>
+          </w:p>
+        </w:tc>
+        <w:tc>
+          <w:tcPr>
+            <w:tcW w:type="dxa" w:w="4320"/>
+          </w:tcPr>
+          <w:p>
+            <w:r>
+              <w:t>Creates a numbered list or bullet list</w:t>
+            </w:r>
+          </w:p>
+        </w:tc>
+      </w:tr>
+      <w:tr>
+        <w:tc>
+          <w:tcPr>
+            <w:tcW w:type="dxa" w:w="4320"/>
+          </w:tcPr>
+          <w:p>
+            <w:r>
+              <w:t>Image icon</w:t>
+            </w:r>
+          </w:p>
+        </w:tc>
+        <w:tc>
+          <w:tcPr>
+            <w:tcW w:type="dxa" w:w="4320"/>
+          </w:tcPr>
+          <w:p>
+            <w:r>
+              <w:t>Opens a file picker to insert an image from your computer</w:t>
+            </w:r>
+          </w:p>
+        </w:tc>
+      </w:tr>
+    </w:tbl>
+    <w:p/>
+    <w:p>
+      <w:r>
+        <w:t>To format text: select (highlight) the text you want to change, then click the appropriate toolbar button. This works exactly like Microsoft Word.</w:t>
+      </w:r>
+    </w:p>
+    <w:p>
+      <w:pPr>
+        <w:pStyle w:val="Heading1"/>
+      </w:pPr>
+      <w:r>
+        <w:t>5. Printing Your Poster</w:t>
+      </w:r>
+    </w:p>
+    <w:p>
+      <w:r>
+        <w:t>The downloaded PDF is sized for A0 landscape printing (841 × 594 mm).</w:t>
       </w:r>
     </w:p>
     <w:p>
@@ -663,311 +815,7 @@
         <w:pStyle w:val="ListBullet"/>
       </w:pPr>
       <w:r>
-        <w:t>Click the × button to remove a section</w:t>
-      </w:r>
-    </w:p>
-    <w:p>
-      <w:pPr>
-        <w:pStyle w:val="Heading2"/>
-      </w:pPr>
-      <w:r>
-        <w:t>Step 3: Upload Images (Optional)</w:t>
-      </w:r>
-    </w:p>
-    <w:p>
-      <w:r>
-        <w:t>Scroll down to the "Upload Images" section. Click the file picker, select your image (PNG, JPG, or GIF), and click "Upload". A thumbnail will appear with a Markdown tag — click it to copy, then paste it into any section's content area.</w:t>
-      </w:r>
-    </w:p>
-    <w:p>
-      <w:pPr>
-        <w:pStyle w:val="Heading2"/>
-      </w:pPr>
-      <w:r>
-        <w:t>Step 4: Preview</w:t>
-      </w:r>
-    </w:p>
-    <w:p>
-      <w:r>
-        <w:t>Click the "Preview Poster" button. A preview of your poster will appear at the bottom of the page. Check that all your content, images, and tables appear correctly.</w:t>
-      </w:r>
-    </w:p>
-    <w:p>
-      <w:pPr>
-        <w:pStyle w:val="Heading2"/>
-      </w:pPr>
-      <w:r>
-        <w:t>Step 5: Download PDF</w:t>
-      </w:r>
-    </w:p>
-    <w:p>
-      <w:r>
-        <w:t>When you are satisfied with the preview, click "Download PDF". The tool will generate an A0-sized PDF (841 × 594 mm) and download it to your computer. This file is ready for professional printing.</w:t>
-      </w:r>
-    </w:p>
-    <w:p>
-      <w:pPr>
-        <w:pStyle w:val="Heading1"/>
-      </w:pPr>
-      <w:r>
-        <w:t>4. Writing Content in Markdown</w:t>
-      </w:r>
-    </w:p>
-    <w:p>
-      <w:r>
-        <w:t>Markdown is a simple way to format text using plain characters. You do not need to learn any complicated software — just type naturally and use these simple rules:</w:t>
-      </w:r>
-    </w:p>
-    <w:p>
-      <w:pPr>
-        <w:pStyle w:val="Heading2"/>
-      </w:pPr>
-      <w:r>
-        <w:t>Bold and Italic Text</w:t>
-      </w:r>
-    </w:p>
-    <w:p>
-      <w:r>
-        <w:rPr>
-          <w:b/>
-        </w:rPr>
-        <w:t xml:space="preserve">Type: </w:t>
-      </w:r>
-      <w:r>
-        <w:t xml:space="preserve">**bold text**  →  </w:t>
-      </w:r>
-      <w:r>
-        <w:rPr>
-          <w:b/>
-        </w:rPr>
-        <w:t>bold text</w:t>
-      </w:r>
-    </w:p>
-    <w:p>
-      <w:r>
-        <w:rPr>
-          <w:b/>
-        </w:rPr>
-        <w:t xml:space="preserve">Type: </w:t>
-      </w:r>
-      <w:r>
-        <w:t xml:space="preserve">*italic text*  →  </w:t>
-      </w:r>
-      <w:r>
-        <w:rPr>
-          <w:i/>
-        </w:rPr>
-        <w:t>italic text</w:t>
-      </w:r>
-    </w:p>
-    <w:p>
-      <w:pPr>
-        <w:pStyle w:val="Heading2"/>
-      </w:pPr>
-      <w:r>
-        <w:t>Bullet Lists</w:t>
-      </w:r>
-    </w:p>
-    <w:p>
-      <w:r>
-        <w:t>Type each item on a new line starting with a dash:</w:t>
-      </w:r>
-    </w:p>
-    <w:p>
-      <w:r>
-        <w:rPr>
-          <w:rFonts w:ascii="Courier New" w:hAnsi="Courier New"/>
-          <w:sz w:val="20"/>
-        </w:rPr>
-        <w:t>- First item</w:t>
-        <w:br/>
-        <w:t>- Second item</w:t>
-        <w:br/>
-        <w:t>- Third item</w:t>
-      </w:r>
-    </w:p>
-    <w:p>
-      <w:pPr>
-        <w:pStyle w:val="Heading2"/>
-      </w:pPr>
-      <w:r>
-        <w:t>Numbered Lists</w:t>
-      </w:r>
-    </w:p>
-    <w:p>
-      <w:r>
-        <w:t>Type each item with a number:</w:t>
-      </w:r>
-    </w:p>
-    <w:p>
-      <w:r>
-        <w:rPr>
-          <w:rFonts w:ascii="Courier New" w:hAnsi="Courier New"/>
-          <w:sz w:val="20"/>
-        </w:rPr>
-        <w:t>1. First finding</w:t>
-        <w:br/>
-        <w:t>2. Second finding</w:t>
-        <w:br/>
-        <w:t>3. Third finding</w:t>
-      </w:r>
-    </w:p>
-    <w:p>
-      <w:pPr>
-        <w:pStyle w:val="Heading2"/>
-      </w:pPr>
-      <w:r>
-        <w:t>Tables</w:t>
-      </w:r>
-    </w:p>
-    <w:p>
-      <w:r>
-        <w:t>Use pipes (|) and dashes (-) to create tables:</w:t>
-      </w:r>
-    </w:p>
-    <w:p>
-      <w:r>
-        <w:rPr>
-          <w:rFonts w:ascii="Courier New" w:hAnsi="Courier New"/>
-          <w:sz w:val="18"/>
-        </w:rPr>
-        <w:t>| Variable    | Group A | Group B | p-value |</w:t>
-        <w:br/>
-        <w:t>|-------------|---------|---------|--------|</w:t>
-        <w:br/>
-        <w:t>| Age (years) | 45.2    | 43.8    | 0.32   |</w:t>
-        <w:br/>
-        <w:t>| Male (%)    | 58      | 62      | 0.41   |</w:t>
-      </w:r>
-    </w:p>
-    <w:p>
-      <w:pPr>
-        <w:pStyle w:val="Heading2"/>
-      </w:pPr>
-      <w:r>
-        <w:t>Images</w:t>
-      </w:r>
-    </w:p>
-    <w:p>
-      <w:r>
-        <w:t>After uploading an image, paste the Markdown tag:</w:t>
-      </w:r>
-    </w:p>
-    <w:p>
-      <w:r>
-        <w:rPr>
-          <w:rFonts w:ascii="Courier New" w:hAnsi="Courier New"/>
-          <w:sz w:val="20"/>
-        </w:rPr>
-        <w:t>![Figure 1: Survival curve](image_url)</w:t>
-      </w:r>
-    </w:p>
-    <w:p>
-      <w:pPr>
-        <w:pStyle w:val="Heading2"/>
-      </w:pPr>
-      <w:r>
-        <w:t>References</w:t>
-      </w:r>
-    </w:p>
-    <w:p>
-      <w:r>
-        <w:t>Simply type your references as a numbered list:</w:t>
-      </w:r>
-    </w:p>
-    <w:p>
-      <w:r>
-        <w:rPr>
-          <w:rFonts w:ascii="Courier New" w:hAnsi="Courier New"/>
-          <w:sz w:val="18"/>
-        </w:rPr>
-        <w:t>1. Smith J, et al. Title of article. *Journal*. 2024;12(3):45-52.</w:t>
-        <w:br/>
-        <w:t>2. Mwangi A, Ochieng P. Title of article. *Journal*. 2023;8(1):12-18.</w:t>
-      </w:r>
-    </w:p>
-    <w:p>
-      <w:pPr>
-        <w:pStyle w:val="Heading1"/>
-      </w:pPr>
-      <w:r>
-        <w:t>5. Uploading Images</w:t>
-      </w:r>
-    </w:p>
-    <w:p>
-      <w:pPr>
-        <w:pStyle w:val="ListBullet"/>
-      </w:pPr>
-      <w:r>
-        <w:t>Supported formats: PNG, JPG, JPEG, GIF</w:t>
-      </w:r>
-    </w:p>
-    <w:p>
-      <w:pPr>
-        <w:pStyle w:val="ListBullet"/>
-      </w:pPr>
-      <w:r>
-        <w:t>Maximum file size: 16 MB</w:t>
-      </w:r>
-    </w:p>
-    <w:p>
-      <w:pPr>
-        <w:pStyle w:val="ListBullet"/>
-      </w:pPr>
-      <w:r>
-        <w:t>For best results, use images at least 300 DPI for print quality</w:t>
-      </w:r>
-    </w:p>
-    <w:p>
-      <w:pPr>
-        <w:pStyle w:val="ListBullet"/>
-      </w:pPr>
-      <w:r>
-        <w:t>Charts exported from Excel, SPSS, or R work well</w:t>
-      </w:r>
-    </w:p>
-    <w:p>
-      <w:r>
-        <w:t>After uploading, a thumbnail and Markdown tag appear below the upload button. Click the tag to copy it, then paste it into the content area of the appropriate section.</w:t>
-      </w:r>
-    </w:p>
-    <w:p>
-      <w:pPr>
-        <w:pStyle w:val="Heading1"/>
-      </w:pPr>
-      <w:r>
-        <w:t>6. Previewing Your Poster</w:t>
-      </w:r>
-    </w:p>
-    <w:p>
-      <w:r>
-        <w:t>Click "Preview Poster" at any time to see how your poster will look. The preview shows a scaled-down version of the full A0 poster. You can scroll within the preview window to check all sections.</w:t>
-      </w:r>
-    </w:p>
-    <w:p>
-      <w:r>
-        <w:t>Note: The preview is rendered in your browser. The final PDF may have slightly different text wrapping, but the overall layout will be the same.</w:t>
-      </w:r>
-    </w:p>
-    <w:p>
-      <w:pPr>
-        <w:pStyle w:val="Heading1"/>
-      </w:pPr>
-      <w:r>
-        <w:t>7. Downloading Your PDF</w:t>
-      </w:r>
-    </w:p>
-    <w:p>
-      <w:r>
-        <w:t>Click "Download PDF" to generate your poster. The file will be saved as "CCSK_Poster.pdf" in your Downloads folder. This is a high-quality, A0-sized (841 × 594 mm landscape) PDF suitable for professional printing.</w:t>
-      </w:r>
-    </w:p>
-    <w:p>
-      <w:pPr>
-        <w:pStyle w:val="ListBullet"/>
-      </w:pPr>
-      <w:r>
-        <w:t>Printing recommendations:</w:t>
+        <w:t>When printing:</w:t>
       </w:r>
     </w:p>
     <w:p>
@@ -975,7 +823,7 @@
         <w:pStyle w:val="ListBullet2"/>
       </w:pPr>
       <w:r>
-        <w:t>Print at 100% scale (do not "fit to page")</w:t>
+        <w:t>Print at 100% scale (do not select "fit to page")</w:t>
       </w:r>
     </w:p>
     <w:p>
@@ -991,7 +839,7 @@
         <w:pStyle w:val="ListBullet2"/>
       </w:pPr>
       <w:r>
-        <w:t>Standard poster boards at the conference are A0 landscape</w:t>
+        <w:t>Conference poster boards are A0 landscape format</w:t>
       </w:r>
     </w:p>
     <w:p>
@@ -999,7 +847,7 @@
         <w:pStyle w:val="Heading1"/>
       </w:pPr>
       <w:r>
-        <w:t>8. Tips for a Great Poster</w:t>
+        <w:t>6. Tips for a Great Poster</w:t>
       </w:r>
     </w:p>
     <w:p>
@@ -1007,10 +855,10 @@
         <w:rPr>
           <w:b/>
         </w:rPr>
-        <w:t xml:space="preserve">Keep your title short and impactful. </w:t>
+        <w:t xml:space="preserve">Keep your title short. </w:t>
       </w:r>
       <w:r>
-        <w:t>Aim for one to two lines maximum. Avoid abbreviations that are not universally known.</w:t>
+        <w:t>Aim for one to two lines. Avoid uncommon abbreviations.</w:t>
       </w:r>
     </w:p>
     <w:p>
@@ -1018,10 +866,10 @@
         <w:rPr>
           <w:b/>
         </w:rPr>
-        <w:t xml:space="preserve">Less text is more. </w:t>
+        <w:t xml:space="preserve">Less text is better. </w:t>
       </w:r>
       <w:r>
-        <w:t>A poster is not a paper. Use bullet points, short paragraphs, and let your figures tell the story.</w:t>
+        <w:t>A poster is not a paper. Use short paragraphs and bullet points. Let your figures do the talking.</w:t>
       </w:r>
     </w:p>
     <w:p>
@@ -1032,18 +880,7 @@
         <w:t xml:space="preserve">Use high-quality images. </w:t>
       </w:r>
       <w:r>
-        <w:t>Low-resolution screenshots will appear blurry when printed at A0 size. Export figures at 300 DPI or higher.</w:t>
-      </w:r>
-    </w:p>
-    <w:p>
-      <w:r>
-        <w:rPr>
-          <w:b/>
-        </w:rPr>
-        <w:t xml:space="preserve">Highlight key findings. </w:t>
-      </w:r>
-      <w:r>
-        <w:t>Use the "Highlighted" checkbox to draw attention to your most important section, such as your key results or conclusion.</w:t>
+        <w:t>Low-resolution images will look blurry when printed at A0 size.</w:t>
       </w:r>
     </w:p>
     <w:p>
@@ -1054,7 +891,7 @@
         <w:t xml:space="preserve">Include a clear conclusion. </w:t>
       </w:r>
       <w:r>
-        <w:t>Conference attendees may only spend 1–2 minutes at your poster. Make your main message unmissable.</w:t>
+        <w:t>Conference visitors spend 1–2 minutes at each poster. Make your main message easy to find.</w:t>
       </w:r>
     </w:p>
     <w:p>
@@ -1065,7 +902,15 @@
         <w:t xml:space="preserve">Proofread carefully. </w:t>
       </w:r>
       <w:r>
-        <w:t>Check spelling, author names, and data before downloading. The tool does not have a spell-checker.</w:t>
+        <w:t>Check spelling, author names, and data before downloading.</w:t>
+      </w:r>
+    </w:p>
+    <w:p>
+      <w:pPr>
+        <w:pStyle w:val="Heading1"/>
+      </w:pPr>
+      <w:r>
+        <w:t>7. Common Questions</w:t>
       </w:r>
     </w:p>
     <w:p>
@@ -1073,31 +918,12 @@
         <w:rPr>
           <w:b/>
         </w:rPr>
-        <w:t xml:space="preserve">Use tables for data. </w:t>
-      </w:r>
-      <w:r>
-        <w:t>Markdown tables render cleanly in the poster. They are easier to read than dense paragraphs of numbers.</w:t>
-      </w:r>
-    </w:p>
-    <w:p>
-      <w:pPr>
-        <w:pStyle w:val="Heading1"/>
-      </w:pPr>
-      <w:r>
-        <w:t>9. Troubleshooting</w:t>
+        <w:t>Q: The page is taking a long time to load</w:t>
       </w:r>
     </w:p>
     <w:p>
       <w:r>
-        <w:rPr>
-          <w:b/>
-        </w:rPr>
-        <w:t>Problem: The PDF is taking a long time to generate</w:t>
-      </w:r>
-    </w:p>
-    <w:p>
-      <w:r>
-        <w:t>Solution: Large images slow down PDF generation. Try reducing image file sizes before uploading. If using photos, resize them to under 2 MB each.</w:t>
+        <w:t>A: The free hosting may take 30–60 seconds to start up if it has been inactive. Please wait and refresh the page.</w:t>
       </w:r>
     </w:p>
     <w:p/>
@@ -1106,12 +932,12 @@
         <w:rPr>
           <w:b/>
         </w:rPr>
-        <w:t>Problem: My table does not appear correctly</w:t>
+        <w:t>Q: The PDF is slow to generate</w:t>
       </w:r>
     </w:p>
     <w:p>
       <w:r>
-        <w:t>Solution: Ensure you have the header row, a separator row of dashes, and data rows. Each row must have the same number of pipe (|) characters.</w:t>
+        <w:t>A: Large images slow down PDF generation. Try using smaller image files (under 2 MB each).</w:t>
       </w:r>
     </w:p>
     <w:p/>
@@ -1120,12 +946,12 @@
         <w:rPr>
           <w:b/>
         </w:rPr>
-        <w:t>Problem: The text overflows the column</w:t>
+        <w:t>Q: My image is not appearing</w:t>
       </w:r>
     </w:p>
     <w:p>
       <w:r>
-        <w:t>Solution: You may have too much content in one column. Try moving some sections to another column, or shorten your text.</w:t>
+        <w:t>A: Make sure you clicked the image button in the toolbar and selected a valid image file (PNG or JPG).</w:t>
       </w:r>
     </w:p>
     <w:p/>
@@ -1134,12 +960,12 @@
         <w:rPr>
           <w:b/>
         </w:rPr>
-        <w:t>Problem: Images are not showing</w:t>
+        <w:t>Q: I want to start over</w:t>
       </w:r>
     </w:p>
     <w:p>
       <w:r>
-        <w:t>Solution: Make sure you uploaded the image first, then copied and pasted the Markdown tag into your content. The tag must start with ![</w:t>
+        <w:t>A: Simply refresh the page in your browser. All fields will be reset.</w:t>
       </w:r>
     </w:p>
     <w:p/>
@@ -1148,26 +974,12 @@
         <w:rPr>
           <w:b/>
         </w:rPr>
-        <w:t>Problem: The preview looks different from the PDF</w:t>
+        <w:t>Q: The preview looks slightly different from the PDF</w:t>
       </w:r>
     </w:p>
     <w:p>
       <w:r>
-        <w:t>Solution: Minor differences in text wrapping are normal. The PDF is the authoritative output — trust it over the browser preview.</w:t>
-      </w:r>
-    </w:p>
-    <w:p/>
-    <w:p>
-      <w:r>
-        <w:rPr>
-          <w:b/>
-        </w:rPr>
-        <w:t>Problem: The page is not loading</w:t>
-      </w:r>
-    </w:p>
-    <w:p>
-      <w:r>
-        <w:t>Solution: The free hosting service may take 30–60 seconds to start up if it has been inactive. Please wait and refresh.</w:t>
+        <w:t>A: Minor differences are normal. The downloaded PDF is the final version — trust it over the browser preview.</w:t>
       </w:r>
     </w:p>
     <w:p/>
@@ -1176,12 +988,12 @@
         <w:pStyle w:val="Heading1"/>
       </w:pPr>
       <w:r>
-        <w:t>10. Support</w:t>
+        <w:t>8. Need Help?</w:t>
       </w:r>
     </w:p>
     <w:p>
       <w:r>
-        <w:t>If you encounter any issues or need assistance, please contact:</w:t>
+        <w:t>If you have any questions or need assistance, contact us:</w:t>
       </w:r>
     </w:p>
     <w:p/>

</xml_diff>

<commit_message>
Remove fullscreen feature and update user guide for PNG output
Remove the Open Fullscreen (4K TV) button, route, and JS function.
Update user guide to reflect PNG downloads instead of PDF throughout.

Co-Authored-By: Claude Opus 4.6 <noreply@anthropic.com>
</commit_message>
<xml_diff>
--- a/CCSK_Poster_Generator_User_Guide.docx
+++ b/CCSK_Poster_Generator_User_Guide.docx
@@ -95,7 +95,7 @@
     </w:p>
     <w:p>
       <w:r>
-        <w:t>The CCSK Scientific Poster Generator is a free online tool that helps you create a professional, print-ready scientific poster for the conference. You do not need any design software — just type your content into the website, and it creates a beautifully formatted A0 PDF poster with the CCSK conference branding.</w:t>
+        <w:t>The CCSK Scientific Poster Generator is a free online tool that helps you create a professional scientific poster for the conference. You do not need any design software — just type your content into the website, and it creates a beautifully formatted 4K poster image (PNG) with the CCSK conference branding.</w:t>
       </w:r>
     </w:p>
     <w:p>
@@ -586,7 +586,7 @@
         <w:t xml:space="preserve">Tip: </w:t>
       </w:r>
       <w:r>
-        <w:t>For the best print quality, use high-resolution images (300 DPI or higher). Charts exported from Excel, SPSS, or R work well. Avoid small screenshots.</w:t>
+        <w:t>For the best quality, use high-resolution images. Charts exported from Excel, SPSS, or R work well. Avoid small screenshots.</w:t>
       </w:r>
     </w:p>
     <w:p>
@@ -620,12 +620,12 @@
         <w:pStyle w:val="Heading2"/>
       </w:pPr>
       <w:r>
-        <w:t>Step 6: Download your PDF</w:t>
+        <w:t>Step 6: Download and submit your poster</w:t>
       </w:r>
     </w:p>
     <w:p>
       <w:r>
-        <w:t>When you are happy with the preview, click "Download PDF". A file called "CCSK_Poster.pdf" will be saved to your Downloads folder. This is your final poster, ready for printing.</w:t>
+        <w:t>When you are happy with the preview, click "Download PNG (4K)". A high-resolution PNG image will be saved to your Downloads folder. Please do NOT print this poster. Instead, email the downloaded PNG file to:</w:t>
       </w:r>
     </w:p>
     <w:p>
@@ -802,12 +802,12 @@
         <w:pStyle w:val="Heading1"/>
       </w:pPr>
       <w:r>
-        <w:t>5. Printing Your Poster</w:t>
+        <w:t>5. Submitting Your Poster</w:t>
       </w:r>
     </w:p>
     <w:p>
       <w:r>
-        <w:t>The downloaded PDF is sized for A0 landscape printing (841 × 594 mm).</w:t>
+        <w:t>Once you have downloaded your poster image, please submit it by email. Do NOT print the poster yourself — the organising committee will handle all printing.</w:t>
       </w:r>
     </w:p>
     <w:p>
@@ -815,7 +815,7 @@
         <w:pStyle w:val="ListBullet"/>
       </w:pPr>
       <w:r>
-        <w:t>When printing:</w:t>
+        <w:t>Send your PNG file to:</w:t>
       </w:r>
     </w:p>
     <w:p>
@@ -823,7 +823,11 @@
         <w:pStyle w:val="ListBullet2"/>
       </w:pPr>
       <w:r>
-        <w:t>Print at 100% scale (do not select "fit to page")</w:t>
+        <w:rPr>
+          <w:b/>
+          <w:color w:val="3C608C"/>
+        </w:rPr>
+        <w:t>conference@critkenya.org</w:t>
       </w:r>
     </w:p>
     <w:p>
@@ -831,7 +835,7 @@
         <w:pStyle w:val="ListBullet2"/>
       </w:pPr>
       <w:r>
-        <w:t>Use matte or satin paper for best readability</w:t>
+        <w:t>Use the subject line: "Poster Submission — [Your Name]"</w:t>
       </w:r>
     </w:p>
     <w:p>
@@ -839,7 +843,7 @@
         <w:pStyle w:val="ListBullet2"/>
       </w:pPr>
       <w:r>
-        <w:t>Conference poster boards are A0 landscape format</w:t>
+        <w:t>Submission deadline: Please check the conference website for the deadline</w:t>
       </w:r>
     </w:p>
     <w:p>
@@ -880,7 +884,7 @@
         <w:t xml:space="preserve">Use high-quality images. </w:t>
       </w:r>
       <w:r>
-        <w:t>Low-resolution images will look blurry when printed at A0 size.</w:t>
+        <w:t>Low-resolution images will appear blurry on the final poster.</w:t>
       </w:r>
     </w:p>
     <w:p>
@@ -932,12 +936,12 @@
         <w:rPr>
           <w:b/>
         </w:rPr>
-        <w:t>Q: The PDF is slow to generate</w:t>
+        <w:t>Q: The PNG is slow to generate</w:t>
       </w:r>
     </w:p>
     <w:p>
       <w:r>
-        <w:t>A: Large images slow down PDF generation. Try using smaller image files (under 2 MB each).</w:t>
+        <w:t>A: Large images slow down poster generation. Try using smaller image files (under 2 MB each).</w:t>
       </w:r>
     </w:p>
     <w:p/>
@@ -974,12 +978,12 @@
         <w:rPr>
           <w:b/>
         </w:rPr>
-        <w:t>Q: The preview looks slightly different from the PDF</w:t>
+        <w:t>Q: The preview looks slightly different from the downloaded PNG</w:t>
       </w:r>
     </w:p>
     <w:p>
       <w:r>
-        <w:t>A: Minor differences are normal. The downloaded PDF is the final version — trust it over the browser preview.</w:t>
+        <w:t>A: Minor differences are normal. The downloaded PNG is the final version — trust it over the browser preview.</w:t>
       </w:r>
     </w:p>
     <w:p/>

</xml_diff>